<commit_message>
Especificación de valores intermedios
</commit_message>
<xml_diff>
--- a/Base de datos/mejoras.docx
+++ b/Base de datos/mejoras.docx
@@ -5,8 +5,29 @@
     <w:p/>
     <w:p>
       <w:r>
-        <w:t>incluir una explicación debajo de cada pregunta del tipo se pregunta esto por… y por ejemplo en nivel de vision dar algunos datos mas? Tipo que muy poco sea no distinguir formas y mucho es sin problemas etc</w:t>
-      </w:r>
+        <w:t xml:space="preserve">incluir una explicación debajo de cada pregunta del tipo se pregunta esto por… y por ejemplo en nivel de </w:t>
+      </w:r>
+      <w:proofErr w:type="spellStart"/>
+      <w:r>
+        <w:t>vision</w:t>
+      </w:r>
+      <w:proofErr w:type="spellEnd"/>
+      <w:r>
+        <w:t xml:space="preserve"> dar algunos datos </w:t>
+      </w:r>
+      <w:proofErr w:type="spellStart"/>
+      <w:r>
+        <w:t>mas</w:t>
+      </w:r>
+      <w:proofErr w:type="spellEnd"/>
+      <w:r>
+        <w:t xml:space="preserve">? Tipo que muy poco sea no distinguir formas y mucho es sin problemas </w:t>
+      </w:r>
+      <w:proofErr w:type="spellStart"/>
+      <w:r>
+        <w:t>etc</w:t>
+      </w:r>
+      <w:proofErr w:type="spellEnd"/>
     </w:p>
     <w:p>
       <w:r>
@@ -15,13 +36,58 @@
     </w:p>
     <w:p>
       <w:r>
-        <w:t>añadir enlace directo a la compra o adquisición de los saac, eliminar lo de portable</w:t>
-      </w:r>
+        <w:t xml:space="preserve">añadir enlace directo a la compra o adquisición de los </w:t>
+      </w:r>
+      <w:proofErr w:type="spellStart"/>
+      <w:r>
+        <w:t>saac</w:t>
+      </w:r>
+      <w:proofErr w:type="spellEnd"/>
+      <w:r>
+        <w:t>, eliminar lo de portable</w:t>
+      </w:r>
+      <w:r>
+        <w:t xml:space="preserve">, añadir los idiomas y plataformas en los que </w:t>
+      </w:r>
+      <w:proofErr w:type="spellStart"/>
+      <w:r>
+        <w:t>estan</w:t>
+      </w:r>
+      <w:proofErr w:type="spellEnd"/>
     </w:p>
     <w:p>
       <w:r>
-        <w:t>revisar por que no aparece puntero laser ni gafas con puntero laser pero si eye tracker</w:t>
-      </w:r>
+        <w:t xml:space="preserve">revisar </w:t>
+      </w:r>
+      <w:proofErr w:type="spellStart"/>
+      <w:r>
+        <w:t>por que</w:t>
+      </w:r>
+      <w:proofErr w:type="spellEnd"/>
+      <w:r>
+        <w:t xml:space="preserve"> no aparece puntero laser ni gafas con puntero </w:t>
+      </w:r>
+      <w:proofErr w:type="gramStart"/>
+      <w:r>
+        <w:t>laser</w:t>
+      </w:r>
+      <w:proofErr w:type="gramEnd"/>
+      <w:r>
+        <w:t xml:space="preserve"> pero si </w:t>
+      </w:r>
+      <w:proofErr w:type="spellStart"/>
+      <w:r>
+        <w:t>eye</w:t>
+      </w:r>
+      <w:proofErr w:type="spellEnd"/>
+      <w:r>
+        <w:t xml:space="preserve"> </w:t>
+      </w:r>
+      <w:proofErr w:type="spellStart"/>
+      <w:r>
+        <w:t>tracker</w:t>
+      </w:r>
+      <w:proofErr w:type="spellEnd"/>
     </w:p>
     <w:sectPr>
       <w:pgSz w:w="11906" w:h="16838"/>

</xml_diff>

<commit_message>
Cambio portabilidad por plataforma
</commit_message>
<xml_diff>
--- a/Base de datos/mejoras.docx
+++ b/Base de datos/mejoras.docx
@@ -2,33 +2,6 @@
 <file path=word/document.xml><?xml version="1.0" encoding="utf-8"?>
 <w:document xmlns:wpc="http://schemas.microsoft.com/office/word/2010/wordprocessingCanvas" xmlns:cx="http://schemas.microsoft.com/office/drawing/2014/chartex" xmlns:cx1="http://schemas.microsoft.com/office/drawing/2015/9/8/chartex" xmlns:cx2="http://schemas.microsoft.com/office/drawing/2015/10/21/chartex" xmlns:cx3="http://schemas.microsoft.com/office/drawing/2016/5/9/chartex" xmlns:cx4="http://schemas.microsoft.com/office/drawing/2016/5/10/chartex" xmlns:cx5="http://schemas.microsoft.com/office/drawing/2016/5/11/chartex" xmlns:cx6="http://schemas.microsoft.com/office/drawing/2016/5/12/chartex" xmlns:cx7="http://schemas.microsoft.com/office/drawing/2016/5/13/chartex" xmlns:cx8="http://schemas.microsoft.com/office/drawing/2016/5/14/chartex" xmlns:mc="http://schemas.openxmlformats.org/markup-compatibility/2006" xmlns:aink="http://schemas.microsoft.com/office/drawing/2016/ink" xmlns:am3d="http://schemas.microsoft.com/office/drawing/2017/model3d" xmlns:o="urn:schemas-microsoft-com:office:office" xmlns:oel="http://schemas.microsoft.com/office/2019/extlst" xmlns:r="http://schemas.openxmlformats.org/officeDocument/2006/relationships" xmlns:m="http://schemas.openxmlformats.org/officeDocument/2006/math" xmlns:v="urn:schemas-microsoft-com:vml" xmlns:wp14="http://schemas.microsoft.com/office/word/2010/wordprocessingDrawing" xmlns:wp="http://schemas.openxmlformats.org/drawingml/2006/wordprocessingDrawing" xmlns:w10="urn:schemas-microsoft-com:office:word" xmlns:w="http://schemas.openxmlformats.org/wordprocessingml/2006/main" xmlns:w14="http://schemas.microsoft.com/office/word/2010/wordml" xmlns:w15="http://schemas.microsoft.com/office/word/2012/wordml" xmlns:w16cex="http://schemas.microsoft.com/office/word/2018/wordml/cex" xmlns:w16cid="http://schemas.microsoft.com/office/word/2016/wordml/cid" xmlns:w16="http://schemas.microsoft.com/office/word/2018/wordml" xmlns:w16du="http://schemas.microsoft.com/office/word/2023/wordml/word16du" xmlns:w16sdtdh="http://schemas.microsoft.com/office/word/2020/wordml/sdtdatahash" xmlns:w16sdtfl="http://schemas.microsoft.com/office/word/2024/wordml/sdtformatlock" xmlns:w16se="http://schemas.microsoft.com/office/word/2015/wordml/symex" xmlns:wpg="http://schemas.microsoft.com/office/word/2010/wordprocessingGroup" xmlns:wpi="http://schemas.microsoft.com/office/word/2010/wordprocessingInk" xmlns:wne="http://schemas.microsoft.com/office/word/2006/wordml" xmlns:wps="http://schemas.microsoft.com/office/word/2010/wordprocessingShape" mc:Ignorable="w14 w15 w16se w16cid w16 w16cex w16sdtdh w16sdtfl w16du wp14">
   <w:body>
-    <w:p/>
-    <w:p>
-      <w:r>
-        <w:t xml:space="preserve">incluir una explicación debajo de cada pregunta del tipo se pregunta esto por… y por ejemplo en nivel de </w:t>
-      </w:r>
-      <w:proofErr w:type="spellStart"/>
-      <w:r>
-        <w:t>vision</w:t>
-      </w:r>
-      <w:proofErr w:type="spellEnd"/>
-      <w:r>
-        <w:t xml:space="preserve"> dar algunos datos </w:t>
-      </w:r>
-      <w:proofErr w:type="spellStart"/>
-      <w:r>
-        <w:t>mas</w:t>
-      </w:r>
-      <w:proofErr w:type="spellEnd"/>
-      <w:r>
-        <w:t xml:space="preserve">? Tipo que muy poco sea no distinguir formas y mucho es sin problemas </w:t>
-      </w:r>
-      <w:proofErr w:type="spellStart"/>
-      <w:r>
-        <w:t>etc</w:t>
-      </w:r>
-      <w:proofErr w:type="spellEnd"/>
-    </w:p>
     <w:p>
       <w:r>
         <w:t>estudio hacer todas las combis posibles y ver donde no sale nada ahí hay que mejorar</w:t>
@@ -36,58 +9,13 @@
     </w:p>
     <w:p>
       <w:r>
-        <w:t xml:space="preserve">añadir enlace directo a la compra o adquisición de los </w:t>
+        <w:t>añadir los idiomas en los que estan</w:t>
       </w:r>
-      <w:proofErr w:type="spellStart"/>
-      <w:r>
-        <w:t>saac</w:t>
-      </w:r>
-      <w:proofErr w:type="spellEnd"/>
-      <w:r>
-        <w:t>, eliminar lo de portable</w:t>
-      </w:r>
-      <w:r>
-        <w:t xml:space="preserve">, añadir los idiomas y plataformas en los que </w:t>
-      </w:r>
-      <w:proofErr w:type="spellStart"/>
-      <w:r>
-        <w:t>estan</w:t>
-      </w:r>
-      <w:proofErr w:type="spellEnd"/>
     </w:p>
     <w:p>
       <w:r>
-        <w:t xml:space="preserve">revisar </w:t>
+        <w:t>revisar por que no aparece puntero laser ni gafas con puntero laser pero si eye tracker</w:t>
       </w:r>
-      <w:proofErr w:type="spellStart"/>
-      <w:r>
-        <w:t>por que</w:t>
-      </w:r>
-      <w:proofErr w:type="spellEnd"/>
-      <w:r>
-        <w:t xml:space="preserve"> no aparece puntero laser ni gafas con puntero </w:t>
-      </w:r>
-      <w:proofErr w:type="gramStart"/>
-      <w:r>
-        <w:t>laser</w:t>
-      </w:r>
-      <w:proofErr w:type="gramEnd"/>
-      <w:r>
-        <w:t xml:space="preserve"> pero si </w:t>
-      </w:r>
-      <w:proofErr w:type="spellStart"/>
-      <w:r>
-        <w:t>eye</w:t>
-      </w:r>
-      <w:proofErr w:type="spellEnd"/>
-      <w:r>
-        <w:t xml:space="preserve"> </w:t>
-      </w:r>
-      <w:proofErr w:type="spellStart"/>
-      <w:r>
-        <w:t>tracker</w:t>
-      </w:r>
-      <w:proofErr w:type="spellEnd"/>
     </w:p>
     <w:sectPr>
       <w:pgSz w:w="11906" w:h="16838"/>

</xml_diff>

<commit_message>
Creación de diversas pestañas
</commit_message>
<xml_diff>
--- a/Base de datos/mejoras.docx
+++ b/Base de datos/mejoras.docx
@@ -9,12 +9,75 @@
     </w:p>
     <w:p>
       <w:r>
-        <w:t>añadir los idiomas en los que estan</w:t>
-      </w:r>
+        <w:t xml:space="preserve">añadir los idiomas en los que </w:t>
+      </w:r>
+      <w:proofErr w:type="spellStart"/>
+      <w:r>
+        <w:t>estan</w:t>
+      </w:r>
+      <w:proofErr w:type="spellEnd"/>
     </w:p>
     <w:p>
       <w:r>
-        <w:t>revisar por que no aparece puntero laser ni gafas con puntero laser pero si eye tracker</w:t>
+        <w:t xml:space="preserve">revisar </w:t>
+      </w:r>
+      <w:proofErr w:type="spellStart"/>
+      <w:r>
+        <w:t>por que</w:t>
+      </w:r>
+      <w:proofErr w:type="spellEnd"/>
+      <w:r>
+        <w:t xml:space="preserve"> no aparece puntero laser ni gafas con puntero laser pero si </w:t>
+      </w:r>
+      <w:proofErr w:type="spellStart"/>
+      <w:r>
+        <w:t>eye</w:t>
+      </w:r>
+      <w:proofErr w:type="spellEnd"/>
+      <w:r>
+        <w:t xml:space="preserve"> </w:t>
+      </w:r>
+      <w:proofErr w:type="spellStart"/>
+      <w:r>
+        <w:t>tracker</w:t>
+      </w:r>
+      <w:proofErr w:type="spellEnd"/>
+    </w:p>
+    <w:p>
+      <w:r>
+        <w:t xml:space="preserve">no recomienda el </w:t>
+      </w:r>
+      <w:proofErr w:type="spellStart"/>
+      <w:r>
+        <w:t>eye</w:t>
+      </w:r>
+      <w:proofErr w:type="spellEnd"/>
+      <w:r>
+        <w:t xml:space="preserve"> </w:t>
+      </w:r>
+      <w:proofErr w:type="spellStart"/>
+      <w:r>
+        <w:t>tracker</w:t>
+      </w:r>
+      <w:proofErr w:type="spellEnd"/>
+      <w:r>
+        <w:t xml:space="preserve"> si el nivel tecnológico es bajo, considerar solo filtrar las apps complejas si el nivel tecnológico es bajo, el </w:t>
+      </w:r>
+      <w:proofErr w:type="spellStart"/>
+      <w:r>
+        <w:t>eye</w:t>
+      </w:r>
+      <w:proofErr w:type="spellEnd"/>
+      <w:r>
+        <w:t xml:space="preserve"> </w:t>
+      </w:r>
+      <w:proofErr w:type="spellStart"/>
+      <w:r>
+        <w:t>tracker</w:t>
+      </w:r>
+      <w:proofErr w:type="spellEnd"/>
+      <w:r>
+        <w:t xml:space="preserve"> debe recomendarse</w:t>
       </w:r>
     </w:p>
     <w:sectPr>

</xml_diff>

<commit_message>
Cambio idiomas, adición voicebanks
</commit_message>
<xml_diff>
--- a/Base de datos/mejoras.docx
+++ b/Base de datos/mejoras.docx
@@ -9,11 +9,19 @@
     </w:p>
     <w:p>
       <w:r>
-        <w:t xml:space="preserve">añadir los idiomas en los que </w:t>
-      </w:r>
-      <w:r>
-        <w:t>están</w:t>
-      </w:r>
+        <w:rPr>
+          <w:highlight w:val="yellow"/>
+        </w:rPr>
+        <w:t xml:space="preserve">revisar descripciones </w:t>
+      </w:r>
+      <w:proofErr w:type="spellStart"/>
+      <w:r>
+        <w:rPr>
+          <w:highlight w:val="yellow"/>
+        </w:rPr>
+        <w:t>saac</w:t>
+      </w:r>
+      <w:proofErr w:type="spellEnd"/>
     </w:p>
     <w:p>
       <w:pPr>
@@ -22,27 +30,150 @@
         </w:rPr>
       </w:pPr>
       <w:r>
-        <w:t>incluir periféricos banco de voz..</w:t>
+        <w:rPr>
+          <w:highlight w:val="yellow"/>
+        </w:rPr>
+        <w:t xml:space="preserve">incluir </w:t>
+      </w:r>
+      <w:proofErr w:type="spellStart"/>
+      <w:r>
+        <w:rPr>
+          <w:highlight w:val="yellow"/>
+        </w:rPr>
+        <w:t>info</w:t>
+      </w:r>
+      <w:proofErr w:type="spellEnd"/>
+      <w:r>
+        <w:rPr>
+          <w:highlight w:val="yellow"/>
+        </w:rPr>
+        <w:t xml:space="preserve"> de las cosas por ejemplo enlaces de relevancia (compra, como usar…)</w:t>
       </w:r>
     </w:p>
     <w:p>
       <w:r>
-        <w:t>revisar por que no aparece puntero laser ni gafas con puntero laser pero si eye tracker</w:t>
+        <w:t xml:space="preserve">no recomienda el </w:t>
+      </w:r>
+      <w:proofErr w:type="spellStart"/>
+      <w:r>
+        <w:t>eye</w:t>
+      </w:r>
+      <w:proofErr w:type="spellEnd"/>
+      <w:r>
+        <w:t xml:space="preserve"> </w:t>
+      </w:r>
+      <w:proofErr w:type="spellStart"/>
+      <w:r>
+        <w:t>tracker</w:t>
+      </w:r>
+      <w:proofErr w:type="spellEnd"/>
+      <w:r>
+        <w:t xml:space="preserve"> si el nivel tecnológico es bajo, considerar solo filtrar las </w:t>
+      </w:r>
+      <w:proofErr w:type="gramStart"/>
+      <w:r>
+        <w:t>apps</w:t>
+      </w:r>
+      <w:proofErr w:type="gramEnd"/>
+      <w:r>
+        <w:t xml:space="preserve"> complejas si el nivel tecnológico es bajo, el </w:t>
+      </w:r>
+      <w:proofErr w:type="spellStart"/>
+      <w:r>
+        <w:t>eye</w:t>
+      </w:r>
+      <w:proofErr w:type="spellEnd"/>
+      <w:r>
+        <w:t xml:space="preserve"> </w:t>
+      </w:r>
+      <w:proofErr w:type="spellStart"/>
+      <w:r>
+        <w:t>tracker</w:t>
+      </w:r>
+      <w:proofErr w:type="spellEnd"/>
+      <w:r>
+        <w:t xml:space="preserve"> debe recomendarse</w:t>
+      </w:r>
+      <w:r>
+        <w:t xml:space="preserve"> ya q no requiere mucho nivel tecnológico cambiar nivel en </w:t>
+      </w:r>
+      <w:proofErr w:type="spellStart"/>
+      <w:r>
+        <w:t>bd</w:t>
+      </w:r>
+      <w:proofErr w:type="spellEnd"/>
+      <w:r>
+        <w:t>, igual para banco de voces aun q este puede requerir ayuda</w:t>
       </w:r>
     </w:p>
     <w:p>
       <w:r>
-        <w:t>no recomienda el eye tracker si el nivel tecnológico es bajo, considerar solo filtrar las apps complejas si el nivel tecnológico es bajo, el eye tracker debe recomendarse</w:t>
+        <w:t xml:space="preserve">revisar el </w:t>
+      </w:r>
+      <w:proofErr w:type="spellStart"/>
+      <w:r>
+        <w:t>style</w:t>
+      </w:r>
+      <w:proofErr w:type="spellEnd"/>
+      <w:r>
+        <w:t xml:space="preserve"> de inicio</w:t>
       </w:r>
     </w:p>
     <w:p>
       <w:r>
-        <w:t>revisar con ayuda/sin ayuda</w:t>
+        <w:rPr>
+          <w:highlight w:val="yellow"/>
+        </w:rPr>
+        <w:t>revisar si el criterio de donde se usa corresponde a un criterio de la base de datos</w:t>
       </w:r>
     </w:p>
     <w:p>
       <w:r>
-        <w:t>para nivel 1 de audición recomendar banca de voz</w:t>
+        <w:t xml:space="preserve">sacar </w:t>
+      </w:r>
+      <w:proofErr w:type="spellStart"/>
+      <w:r>
+        <w:t>pagina</w:t>
+      </w:r>
+      <w:proofErr w:type="spellEnd"/>
+      <w:r>
+        <w:t xml:space="preserve"> a la nube</w:t>
+      </w:r>
+    </w:p>
+    <w:p>
+      <w:r>
+        <w:t xml:space="preserve">quitar requiere financiación? Especificar q </w:t>
+      </w:r>
+      <w:proofErr w:type="spellStart"/>
+      <w:r>
+        <w:t>eye</w:t>
+      </w:r>
+      <w:proofErr w:type="spellEnd"/>
+      <w:r>
+        <w:t xml:space="preserve"> </w:t>
+      </w:r>
+      <w:proofErr w:type="spellStart"/>
+      <w:r>
+        <w:t>tracker</w:t>
+      </w:r>
+      <w:proofErr w:type="spellEnd"/>
+      <w:r>
+        <w:t xml:space="preserve"> lo tiene</w:t>
+      </w:r>
+    </w:p>
+    <w:p>
+      <w:r>
+        <w:t xml:space="preserve">meter o quitar variable tiempo entrenamiento q esta en </w:t>
+      </w:r>
+      <w:proofErr w:type="spellStart"/>
+      <w:proofErr w:type="gramStart"/>
+      <w:r>
+        <w:t>bd</w:t>
+      </w:r>
+      <w:proofErr w:type="spellEnd"/>
+      <w:proofErr w:type="gramEnd"/>
+      <w:r>
+        <w:t xml:space="preserve"> pero no en cuestionario</w:t>
       </w:r>
     </w:p>
     <w:p>
@@ -52,8 +183,29 @@
         </w:rPr>
       </w:pPr>
       <w:r>
-        <w:t>revisar el style de inicio</w:t>
-      </w:r>
+        <w:t xml:space="preserve">revisar </w:t>
+      </w:r>
+      <w:proofErr w:type="spellStart"/>
+      <w:r>
+        <w:t>vocalID</w:t>
+      </w:r>
+      <w:proofErr w:type="spellEnd"/>
+      <w:r>
+        <w:t xml:space="preserve"> y </w:t>
+      </w:r>
+      <w:proofErr w:type="spellStart"/>
+      <w:r>
+        <w:t>praat</w:t>
+      </w:r>
+      <w:proofErr w:type="spellEnd"/>
+      <w:r>
+        <w:t xml:space="preserve"> </w:t>
+      </w:r>
+      <w:proofErr w:type="spellStart"/>
+      <w:r>
+        <w:t>voice</w:t>
+      </w:r>
+      <w:proofErr w:type="spellEnd"/>
     </w:p>
     <w:sectPr>
       <w:pgSz w:w="11906" w:h="16838"/>

</xml_diff>

<commit_message>
Anexo prompt IA I
</commit_message>
<xml_diff>
--- a/Base de datos/mejoras.docx
+++ b/Base de datos/mejoras.docx
@@ -5,14 +5,6 @@
     <w:p>
       <w:r>
         <w:t>estudio hacer todas las combis posibles y ver donde no sale nada ahí hay que mejorar</w:t>
-      </w:r>
-    </w:p>
-    <w:p>
-      <w:r>
-        <w:rPr>
-          <w:highlight w:val="yellow"/>
-        </w:rPr>
-        <w:t>revisar descripciones saac</w:t>
       </w:r>
     </w:p>
     <w:p>
@@ -37,8 +29,16 @@
       </w:r>
     </w:p>
     <w:p>
+      <w:pPr>
+        <w:rPr>
+          <w:u w:val="single"/>
+        </w:rPr>
+      </w:pPr>
       <w:r>
         <w:t>revisar el style de inicio</w:t>
+      </w:r>
+      <w:r>
+        <w:t xml:space="preserve"> y saac</w:t>
       </w:r>
     </w:p>
     <w:p>
@@ -73,6 +73,20 @@
       <w:r>
         <w:t>revisar catalogo CEAPAT e incluirlo en referencias</w:t>
       </w:r>
+      <w:r>
+        <w:t xml:space="preserve"> </w:t>
+      </w:r>
+      <w:hyperlink r:id="rId4" w:history="1">
+        <w:r>
+          <w:rPr>
+            <w:rStyle w:val="Hipervnculo"/>
+          </w:rPr>
+          <w:t>https://catalogoceapat.imserso.es/productos/categorias/variascategorias</w:t>
+        </w:r>
+      </w:hyperlink>
+      <w:r>
+        <w:t xml:space="preserve"> </w:t>
+      </w:r>
     </w:p>
     <w:p>
       <w:pPr>
@@ -80,9 +94,6 @@
           <w:u w:val="single"/>
         </w:rPr>
       </w:pPr>
-      <w:r>
-        <w:t>en la parte de marco teórico incluir donde dice las formas de clasificación de los saac las categorías entre parentesis</w:t>
-      </w:r>
     </w:p>
     <w:sectPr>
       <w:pgSz w:w="11906" w:h="16838"/>
@@ -1011,6 +1022,29 @@
       <w:spacing w:val="5"/>
     </w:rPr>
   </w:style>
+  <w:style w:type="character" w:styleId="Hipervnculo">
+    <w:name w:val="Hyperlink"/>
+    <w:basedOn w:val="Fuentedeprrafopredeter"/>
+    <w:uiPriority w:val="99"/>
+    <w:unhideWhenUsed/>
+    <w:rsid w:val="00821F7C"/>
+    <w:rPr>
+      <w:color w:val="467886" w:themeColor="hyperlink"/>
+      <w:u w:val="single"/>
+    </w:rPr>
+  </w:style>
+  <w:style w:type="character" w:styleId="Mencinsinresolver">
+    <w:name w:val="Unresolved Mention"/>
+    <w:basedOn w:val="Fuentedeprrafopredeter"/>
+    <w:uiPriority w:val="99"/>
+    <w:semiHidden/>
+    <w:unhideWhenUsed/>
+    <w:rsid w:val="00821F7C"/>
+    <w:rPr>
+      <w:color w:val="605E5C"/>
+      <w:shd w:val="clear" w:color="auto" w:fill="E1DFDD"/>
+    </w:rPr>
+  </w:style>
 </w:styles>
 </file>
 

</xml_diff>

<commit_message>
Cambio en alertas por exterior
</commit_message>
<xml_diff>
--- a/Base de datos/mejoras.docx
+++ b/Base de datos/mejoras.docx
@@ -5,6 +5,22 @@
     <w:p>
       <w:r>
         <w:t>estudio hacer todas las combis posibles y ver donde no sale nada ahí hay que mejorar</w:t>
+      </w:r>
+      <w:r>
+        <w:t xml:space="preserve">. Preguntar a la ia todas las combinaciones a hacer para estudiar </w:t>
+      </w:r>
+    </w:p>
+    <w:p>
+      <w:r>
+        <w:rPr>
+          <w:highlight w:val="yellow"/>
+        </w:rPr>
+        <w:t>incluir info de las cosas por ejemplo enlaces de relevancia (compra, como usar…)</w:t>
+      </w:r>
+    </w:p>
+    <w:p>
+      <w:r>
+        <w:t>cambiar descripción de web por la misma de base de datos</w:t>
       </w:r>
     </w:p>
     <w:p>
@@ -14,54 +30,52 @@
         </w:rPr>
       </w:pPr>
       <w:r>
-        <w:rPr>
-          <w:highlight w:val="yellow"/>
-        </w:rPr>
-        <w:t>incluir info de las cosas por ejemplo enlaces de relevancia (compra, como usar…)</w:t>
+        <w:t>cambiar en metodología lo de 29 saac iniciales para especificar q hay periféricos y bancos de voz</w:t>
       </w:r>
     </w:p>
     <w:p>
       <w:r>
-        <w:t>no recomienda el eye tracker si el nivel tecnológico es bajo, considerar solo filtrar las apps complejas si el nivel tecnológico es bajo, el eye tracker debe recomendarse</w:t>
-      </w:r>
-      <w:r>
-        <w:t xml:space="preserve"> ya q no requiere mucho nivel tecnológico cambiar nivel en bd, igual para banco de voces aun q este puede requerir ayuda</w:t>
+        <w:t xml:space="preserve">no recomienda el eye tracker si el nivel tecnológico es bajo, considerar solo filtrar las </w:t>
+      </w:r>
+      <w:proofErr w:type="gramStart"/>
+      <w:r>
+        <w:t>apps</w:t>
+      </w:r>
+      <w:proofErr w:type="gramEnd"/>
+      <w:r>
+        <w:t xml:space="preserve"> complejas si el nivel tecnológico es bajo, el eye tracker debe recomendarse</w:t>
+      </w:r>
+      <w:r>
+        <w:t xml:space="preserve"> ya q no requiere mucho nivel tecnológico</w:t>
+      </w:r>
+      <w:r>
+        <w:t>?</w:t>
+      </w:r>
+      <w:r>
+        <w:t xml:space="preserve"> cambiar nivel en bd, igual para banco de voces aun q este puede requerir ayuda</w:t>
       </w:r>
     </w:p>
     <w:p>
-      <w:pPr>
-        <w:rPr>
-          <w:u w:val="single"/>
-        </w:rPr>
-      </w:pPr>
-      <w:r>
-        <w:t>revisar el style de inicio</w:t>
-      </w:r>
-      <w:r>
-        <w:t xml:space="preserve"> y saac</w:t>
+      <w:r>
+        <w:t>sacar pagina a la nube</w:t>
       </w:r>
     </w:p>
     <w:p>
       <w:r>
-        <w:rPr>
-          <w:highlight w:val="yellow"/>
-        </w:rPr>
-        <w:t>revisar si el criterio de donde se usa corresponde a un criterio de la base de datos</w:t>
+        <w:t>quitar requiere financiación? Especificar q eye tracker lo tiene</w:t>
       </w:r>
     </w:p>
     <w:p>
       <w:r>
-        <w:t>sacar pagina a la nube</w:t>
-      </w:r>
-    </w:p>
-    <w:p>
-      <w:r>
-        <w:t>quitar requiere financiación? Especificar q eye tracker lo tiene</w:t>
-      </w:r>
-    </w:p>
-    <w:p>
-      <w:r>
-        <w:t>meter o quitar variable tiempo entrenamiento q esta en bd pero no en cuestionario</w:t>
+        <w:t xml:space="preserve">meter o quitar variable tiempo entrenamiento q esta en </w:t>
+      </w:r>
+      <w:proofErr w:type="gramStart"/>
+      <w:r>
+        <w:t>bd</w:t>
+      </w:r>
+      <w:proofErr w:type="gramEnd"/>
+      <w:r>
+        <w:t xml:space="preserve"> pero no en cuestionario</w:t>
       </w:r>
     </w:p>
     <w:p>

</xml_diff>

<commit_message>
Voice Banking como tabla separada
</commit_message>
<xml_diff>
--- a/Base de datos/mejoras.docx
+++ b/Base de datos/mejoras.docx
@@ -20,7 +20,7 @@
     </w:p>
     <w:p>
       <w:r>
-        <w:t>cambiar descripción de web por la misma de base de datos</w:t>
+        <w:t>cambiar en metodología lo de 29 saac iniciales para especificar q hay periféricos y bancos de voz</w:t>
       </w:r>
     </w:p>
     <w:p>
@@ -30,52 +30,12 @@
         </w:rPr>
       </w:pPr>
       <w:r>
-        <w:t>cambiar en metodología lo de 29 saac iniciales para especificar q hay periféricos y bancos de voz</w:t>
-      </w:r>
-    </w:p>
-    <w:p>
-      <w:r>
-        <w:t xml:space="preserve">no recomienda el eye tracker si el nivel tecnológico es bajo, considerar solo filtrar las </w:t>
-      </w:r>
-      <w:proofErr w:type="gramStart"/>
-      <w:r>
-        <w:t>apps</w:t>
-      </w:r>
-      <w:proofErr w:type="gramEnd"/>
-      <w:r>
-        <w:t xml:space="preserve"> complejas si el nivel tecnológico es bajo, el eye tracker debe recomendarse</w:t>
-      </w:r>
-      <w:r>
-        <w:t xml:space="preserve"> ya q no requiere mucho nivel tecnológico</w:t>
-      </w:r>
-      <w:r>
-        <w:t>?</w:t>
-      </w:r>
-      <w:r>
-        <w:t xml:space="preserve"> cambiar nivel en bd, igual para banco de voces aun q este puede requerir ayuda</w:t>
+        <w:t>revisar si se usa cerebro o quitarlo</w:t>
       </w:r>
     </w:p>
     <w:p>
       <w:r>
         <w:t>sacar pagina a la nube</w:t>
-      </w:r>
-    </w:p>
-    <w:p>
-      <w:r>
-        <w:t>quitar requiere financiación? Especificar q eye tracker lo tiene</w:t>
-      </w:r>
-    </w:p>
-    <w:p>
-      <w:r>
-        <w:t xml:space="preserve">meter o quitar variable tiempo entrenamiento q esta en </w:t>
-      </w:r>
-      <w:proofErr w:type="gramStart"/>
-      <w:r>
-        <w:t>bd</w:t>
-      </w:r>
-      <w:proofErr w:type="gramEnd"/>
-      <w:r>
-        <w:t xml:space="preserve"> pero no en cuestionario</w:t>
       </w:r>
     </w:p>
     <w:p>

</xml_diff>

<commit_message>
Ajustes rápidos antes de presentar a ELACyL
</commit_message>
<xml_diff>
--- a/Base de datos/mejoras.docx
+++ b/Base de datos/mejoras.docx
@@ -30,7 +30,33 @@
     </w:p>
     <w:p>
       <w:r>
+        <w:t>poner nota de no se han encontrado saacs compatibles y poner otra de por que razón podría ser (por ejemplo si el nivel tecnológico es bajo poner que igual deberían intentarlo pero requerirá tiempo de estudio)</w:t>
+      </w:r>
+    </w:p>
+    <w:p>
+      <w:r>
+        <w:t xml:space="preserve">recomendar eye tracker antes de tiempo para que practiquen? </w:t>
+      </w:r>
+    </w:p>
+    <w:p>
+      <w:pPr>
+        <w:rPr>
+          <w:highlight w:val="yellow"/>
+        </w:rPr>
+      </w:pPr>
+      <w:r>
+        <w:rPr>
+          <w:highlight w:val="yellow"/>
+        </w:rPr>
         <w:t>sacar pagina a la nube</w:t>
+      </w:r>
+    </w:p>
+    <w:p>
+      <w:r>
+        <w:rPr>
+          <w:highlight w:val="yellow"/>
+        </w:rPr>
+        <w:t>hacer que se guarden las pruebas para presentar en resultados</w:t>
       </w:r>
     </w:p>
     <w:p>

</xml_diff>

<commit_message>
Primeros cambios sugeridos por ELACyL
</commit_message>
<xml_diff>
--- a/Base de datos/mejoras.docx
+++ b/Base de datos/mejoras.docx
@@ -12,11 +12,6 @@
     </w:p>
     <w:p>
       <w:r>
-        <w:t>poner nota con los precios para esto rondan tal</w:t>
-      </w:r>
-    </w:p>
-    <w:p>
-      <w:r>
         <w:t>cambiar en metodología lo de 29 saac iniciales para especificar q hay periféricos y bancos de voz</w:t>
       </w:r>
     </w:p>
@@ -27,6 +22,9 @@
       <w:r>
         <w:t xml:space="preserve"> ya que yo he hecho una selección pero seguro hay muchos mas y otros que aun no se hayan inventado</w:t>
       </w:r>
+      <w:r>
+        <w:t xml:space="preserve"> también validar mas el cuestionario hacer mas pruebas por ejemplo con ELA Andalucia</w:t>
+      </w:r>
     </w:p>
     <w:p>
       <w:r>
@@ -35,7 +33,7 @@
     </w:p>
     <w:p>
       <w:r>
-        <w:t xml:space="preserve">recomendar eye tracker antes de tiempo para que practiquen? </w:t>
+        <w:t>recomendar eye tracker antes de tiempo para que practiquen</w:t>
       </w:r>
     </w:p>
     <w:p>
@@ -49,14 +47,6 @@
           <w:highlight w:val="yellow"/>
         </w:rPr>
         <w:t>sacar pagina a la nube</w:t>
-      </w:r>
-    </w:p>
-    <w:p>
-      <w:r>
-        <w:rPr>
-          <w:highlight w:val="yellow"/>
-        </w:rPr>
-        <w:t>hacer que se guarden las pruebas para presentar en resultados</w:t>
       </w:r>
     </w:p>
     <w:p>
@@ -79,12 +69,130 @@
       </w:r>
     </w:p>
     <w:p>
+      <w:r>
+        <w:t xml:space="preserve">posibilidad de incluir esto al inicio </w:t>
+      </w:r>
+      <w:hyperlink r:id="rId5" w:history="1">
+        <w:r>
+          <w:rPr>
+            <w:rStyle w:val="Hipervnculo"/>
+          </w:rPr>
+          <w:t>https://iaeav.lucentia.es/</w:t>
+        </w:r>
+      </w:hyperlink>
+      <w:r>
+        <w:t xml:space="preserve"> como info de progreso de la enfermedad</w:t>
+      </w:r>
+    </w:p>
+    <w:p>
+      <w:r>
+        <w:t>distinguir entre dos tipos de ELA bulbar y espinal</w:t>
+      </w:r>
+    </w:p>
+    <w:p>
+      <w:r>
+        <w:t>sugerir que se mire la financiación según su comunidad autónoma y especificar para castilla y león cual es</w:t>
+      </w:r>
+      <w:r>
+        <w:t>, consultar catalogo de su comunidad</w:t>
+      </w:r>
+    </w:p>
+    <w:p>
+      <w:r>
+        <w:t>añadir megaBEE, optikey, guantes antiincrustante, puntero (chino) y ratón bluetooth</w:t>
+      </w:r>
+    </w:p>
+    <w:p>
+      <w:r>
+        <w:t>añadir enlaces de ejemplos de uso</w:t>
+      </w:r>
+    </w:p>
+    <w:p>
+      <w:r>
+        <w:t>añadir opciones de domotica (Alexa configurada para subir persianas o encender luces)</w:t>
+      </w:r>
+    </w:p>
+    <w:p>
+      <w:r>
+        <w:t>Cambiar el color de la página a verde  (color representante de la ELA)</w:t>
+      </w:r>
+    </w:p>
+    <w:p>
+      <w:r>
+        <w:t>Con lector ocular decir que hay que evitar luces directas y apagar dispositivos como televisiones</w:t>
+      </w:r>
+    </w:p>
+    <w:p>
+      <w:r>
+        <w:t xml:space="preserve">En el nivel de comprensión </w:t>
+      </w:r>
+      <w:r>
+        <w:t>cambiarlo a alfabetización por personas que igual no saben leer (poner ej como prefieres comunicarte mediante frases o pictogramas</w:t>
+      </w:r>
+    </w:p>
+    <w:p>
       <w:pPr>
         <w:rPr>
-          <w:u w:val="single"/>
+          <w:color w:val="EE0000"/>
         </w:rPr>
       </w:pPr>
-    </w:p>
+      <w:r>
+        <w:rPr>
+          <w:color w:val="EE0000"/>
+        </w:rPr>
+        <w:t xml:space="preserve">Preguntar que tienen ya (si ya tienen eye tracker por ejemplo no recomendar)? </w:t>
+      </w:r>
+    </w:p>
+    <w:p>
+      <w:r>
+        <w:t>Hardware propio cambiarlo por la opción ninguno para que así se sepa que recomienda cosas de baja tecnología</w:t>
+      </w:r>
+    </w:p>
+    <w:p>
+      <w:r>
+        <w:t>Soplido y barbilla casi no se usan así que capar un poco</w:t>
+      </w:r>
+    </w:p>
+    <w:p>
+      <w:r>
+        <w:t>Cuando se sugiera algo de alta tecnología recordar que la de baja es buena para ciertas situaciones como lluvia, ducha, mucho sol, nos quedamos sin batería o se rompe…</w:t>
+      </w:r>
+    </w:p>
+    <w:p>
+      <w:r>
+        <w:t>Poner para mayor asesoramiento contactar con la asociación</w:t>
+      </w:r>
+    </w:p>
+    <w:p>
+      <w:r>
+        <w:lastRenderedPageBreak/>
+        <w:t>Cambiar introducir tu nombre por dato semi anonimizado (por ejemplo tu animal favorito y las dos primeras letras de tu apellido)</w:t>
+      </w:r>
+    </w:p>
+    <w:p>
+      <w:pPr>
+        <w:rPr>
+          <w:color w:val="EE0000"/>
+        </w:rPr>
+      </w:pPr>
+      <w:r>
+        <w:rPr>
+          <w:color w:val="EE0000"/>
+        </w:rPr>
+        <w:t>Poner un aviso de que se respeta la confidencialidad y anonimizacion de datos</w:t>
+      </w:r>
+    </w:p>
+    <w:p>
+      <w:r>
+        <w:t>la escala es de propia cosecha se puede hacer eso? Cual es mi validez para decidir los criterios y umbrales?</w:t>
+      </w:r>
+    </w:p>
+    <w:p>
+      <w:r>
+        <w:t>Añadir pregunta final de, te ha servido esta recomendación?</w:t>
+      </w:r>
+    </w:p>
+    <w:p/>
     <w:sectPr>
       <w:pgSz w:w="11906" w:h="16838"/>
       <w:pgMar w:top="1417" w:right="1701" w:bottom="1417" w:left="1701" w:header="708" w:footer="708" w:gutter="0"/>

</xml_diff>

<commit_message>
cambios estructurales y anonimización
</commit_message>
<xml_diff>
--- a/Base de datos/mejoras.docx
+++ b/Base de datos/mejoras.docx
@@ -3,82 +3,254 @@
 <w:document xmlns:wpc="http://schemas.microsoft.com/office/word/2010/wordprocessingCanvas" xmlns:cx="http://schemas.microsoft.com/office/drawing/2014/chartex" xmlns:cx1="http://schemas.microsoft.com/office/drawing/2015/9/8/chartex" xmlns:cx2="http://schemas.microsoft.com/office/drawing/2015/10/21/chartex" xmlns:cx3="http://schemas.microsoft.com/office/drawing/2016/5/9/chartex" xmlns:cx4="http://schemas.microsoft.com/office/drawing/2016/5/10/chartex" xmlns:cx5="http://schemas.microsoft.com/office/drawing/2016/5/11/chartex" xmlns:cx6="http://schemas.microsoft.com/office/drawing/2016/5/12/chartex" xmlns:cx7="http://schemas.microsoft.com/office/drawing/2016/5/13/chartex" xmlns:cx8="http://schemas.microsoft.com/office/drawing/2016/5/14/chartex" xmlns:mc="http://schemas.openxmlformats.org/markup-compatibility/2006" xmlns:aink="http://schemas.microsoft.com/office/drawing/2016/ink" xmlns:am3d="http://schemas.microsoft.com/office/drawing/2017/model3d" xmlns:o="urn:schemas-microsoft-com:office:office" xmlns:oel="http://schemas.microsoft.com/office/2019/extlst" xmlns:r="http://schemas.openxmlformats.org/officeDocument/2006/relationships" xmlns:m="http://schemas.openxmlformats.org/officeDocument/2006/math" xmlns:v="urn:schemas-microsoft-com:vml" xmlns:wp14="http://schemas.microsoft.com/office/word/2010/wordprocessingDrawing" xmlns:wp="http://schemas.openxmlformats.org/drawingml/2006/wordprocessingDrawing" xmlns:w10="urn:schemas-microsoft-com:office:word" xmlns:w="http://schemas.openxmlformats.org/wordprocessingml/2006/main" xmlns:w14="http://schemas.microsoft.com/office/word/2010/wordml" xmlns:w15="http://schemas.microsoft.com/office/word/2012/wordml" xmlns:w16cex="http://schemas.microsoft.com/office/word/2018/wordml/cex" xmlns:w16cid="http://schemas.microsoft.com/office/word/2016/wordml/cid" xmlns:w16="http://schemas.microsoft.com/office/word/2018/wordml" xmlns:w16du="http://schemas.microsoft.com/office/word/2023/wordml/word16du" xmlns:w16sdtdh="http://schemas.microsoft.com/office/word/2020/wordml/sdtdatahash" xmlns:w16sdtfl="http://schemas.microsoft.com/office/word/2024/wordml/sdtformatlock" xmlns:w16se="http://schemas.microsoft.com/office/word/2015/wordml/symex" xmlns:wpg="http://schemas.microsoft.com/office/word/2010/wordprocessingGroup" xmlns:wpi="http://schemas.microsoft.com/office/word/2010/wordprocessingInk" xmlns:wne="http://schemas.microsoft.com/office/word/2006/wordml" xmlns:wps="http://schemas.microsoft.com/office/word/2010/wordprocessingShape" mc:Ignorable="w14 w15 w16se w16cid w16 w16cex w16sdtdh w16sdtfl w16du wp14">
   <w:body>
     <w:p>
-      <w:r>
+      <w:pPr>
+        <w:rPr>
+          <w:highlight w:val="green"/>
+        </w:rPr>
+      </w:pPr>
+      <w:r>
+        <w:rPr>
+          <w:highlight w:val="green"/>
+        </w:rPr>
         <w:t>estudio hacer todas las combis posibles y ver donde no sale nada ahí hay que mejorar</w:t>
       </w:r>
       <w:r>
-        <w:t xml:space="preserve">. Preguntar a la ia todas las combinaciones a hacer para estudiar </w:t>
-      </w:r>
-    </w:p>
-    <w:p>
-      <w:r>
-        <w:t>cambiar en metodología lo de 29 saac iniciales para especificar q hay periféricos y bancos de voz</w:t>
-      </w:r>
-    </w:p>
-    <w:p>
-      <w:r>
-        <w:t>en líneas futuras poner accesibilidad y que se podría ir aumentando la base de datos</w:t>
-      </w:r>
-      <w:r>
-        <w:t xml:space="preserve"> ya que yo he hecho una selección pero seguro hay muchos mas y otros que aun no se hayan inventado</w:t>
-      </w:r>
-      <w:r>
-        <w:t xml:space="preserve"> también validar mas el cuestionario hacer mas pruebas por ejemplo con ELA Andalucia</w:t>
-      </w:r>
-    </w:p>
-    <w:p>
-      <w:r>
-        <w:t>recomendar eye tracker antes de tiempo para que practiquen</w:t>
-      </w:r>
-    </w:p>
-    <w:p>
-      <w:r>
-        <w:t>revisar diferencia entre entrada por manos o pulsador, realmente los saacs serán los mismos no?</w:t>
-      </w:r>
-    </w:p>
-    <w:p>
-      <w:r>
-        <w:t>Añadir en periféricos o algo así ordenador o tablet</w:t>
+        <w:rPr>
+          <w:highlight w:val="green"/>
+        </w:rPr>
+        <w:t xml:space="preserve">. Preguntar a la </w:t>
+      </w:r>
+      <w:proofErr w:type="spellStart"/>
+      <w:r>
+        <w:rPr>
+          <w:highlight w:val="green"/>
+        </w:rPr>
+        <w:t>ia</w:t>
+      </w:r>
+      <w:proofErr w:type="spellEnd"/>
+      <w:r>
+        <w:rPr>
+          <w:highlight w:val="green"/>
+        </w:rPr>
+        <w:t xml:space="preserve"> todas las combinaciones a hacer para estudiar </w:t>
       </w:r>
     </w:p>
     <w:p>
       <w:pPr>
         <w:rPr>
-          <w:highlight w:val="yellow"/>
+          <w:highlight w:val="green"/>
         </w:rPr>
       </w:pPr>
       <w:r>
         <w:rPr>
-          <w:highlight w:val="yellow"/>
-        </w:rPr>
-        <w:t>sacar pagina a la nube</w:t>
+          <w:highlight w:val="green"/>
+        </w:rPr>
+        <w:t xml:space="preserve">cambiar en metodología lo de 29 </w:t>
+      </w:r>
+      <w:proofErr w:type="spellStart"/>
+      <w:r>
+        <w:rPr>
+          <w:highlight w:val="green"/>
+        </w:rPr>
+        <w:t>saac</w:t>
+      </w:r>
+      <w:proofErr w:type="spellEnd"/>
+      <w:r>
+        <w:rPr>
+          <w:highlight w:val="green"/>
+        </w:rPr>
+        <w:t xml:space="preserve"> iniciales para especificar q hay periféricos y bancos de voz</w:t>
       </w:r>
     </w:p>
     <w:p>
       <w:r>
+        <w:rPr>
+          <w:highlight w:val="green"/>
+        </w:rPr>
+        <w:t>en líneas futuras poner accesibilidad y que se podría ir aumentando la base de datos</w:t>
+      </w:r>
+      <w:r>
+        <w:rPr>
+          <w:highlight w:val="green"/>
+        </w:rPr>
+        <w:t xml:space="preserve"> ya que yo he hecho una </w:t>
+      </w:r>
+      <w:proofErr w:type="gramStart"/>
+      <w:r>
+        <w:rPr>
+          <w:highlight w:val="green"/>
+        </w:rPr>
+        <w:t>selección</w:t>
+      </w:r>
+      <w:proofErr w:type="gramEnd"/>
+      <w:r>
+        <w:rPr>
+          <w:highlight w:val="green"/>
+        </w:rPr>
+        <w:t xml:space="preserve"> pero seguro hay muchos </w:t>
+      </w:r>
+      <w:proofErr w:type="spellStart"/>
+      <w:r>
+        <w:rPr>
+          <w:highlight w:val="green"/>
+        </w:rPr>
+        <w:t>mas</w:t>
+      </w:r>
+      <w:proofErr w:type="spellEnd"/>
+      <w:r>
+        <w:rPr>
+          <w:highlight w:val="green"/>
+        </w:rPr>
+        <w:t xml:space="preserve"> y otros que </w:t>
+      </w:r>
+      <w:proofErr w:type="spellStart"/>
+      <w:r>
+        <w:rPr>
+          <w:highlight w:val="green"/>
+        </w:rPr>
+        <w:t>aun</w:t>
+      </w:r>
+      <w:proofErr w:type="spellEnd"/>
+      <w:r>
+        <w:rPr>
+          <w:highlight w:val="green"/>
+        </w:rPr>
+        <w:t xml:space="preserve"> no se hayan inventado</w:t>
+      </w:r>
+      <w:r>
+        <w:rPr>
+          <w:highlight w:val="green"/>
+        </w:rPr>
+        <w:t xml:space="preserve"> también validar </w:t>
+      </w:r>
+      <w:proofErr w:type="spellStart"/>
+      <w:r>
+        <w:rPr>
+          <w:highlight w:val="green"/>
+        </w:rPr>
+        <w:t>mas</w:t>
+      </w:r>
+      <w:proofErr w:type="spellEnd"/>
+      <w:r>
+        <w:rPr>
+          <w:highlight w:val="green"/>
+        </w:rPr>
+        <w:t xml:space="preserve"> el cuestionario hacer </w:t>
+      </w:r>
+      <w:proofErr w:type="spellStart"/>
+      <w:r>
+        <w:rPr>
+          <w:highlight w:val="green"/>
+        </w:rPr>
+        <w:t>mas</w:t>
+      </w:r>
+      <w:proofErr w:type="spellEnd"/>
+      <w:r>
+        <w:rPr>
+          <w:highlight w:val="green"/>
+        </w:rPr>
+        <w:t xml:space="preserve"> pruebas por ejemplo con ELA Andalucia</w:t>
+      </w:r>
+    </w:p>
+    <w:p>
+      <w:r>
+        <w:t xml:space="preserve">recomendar </w:t>
+      </w:r>
+      <w:proofErr w:type="spellStart"/>
+      <w:r>
+        <w:t>eye</w:t>
+      </w:r>
+      <w:proofErr w:type="spellEnd"/>
+      <w:r>
+        <w:t xml:space="preserve"> </w:t>
+      </w:r>
+      <w:proofErr w:type="spellStart"/>
+      <w:r>
+        <w:t>tracker</w:t>
+      </w:r>
+      <w:proofErr w:type="spellEnd"/>
+      <w:r>
+        <w:t xml:space="preserve"> antes de tiempo para que practiquen</w:t>
+      </w:r>
+    </w:p>
+    <w:p>
+      <w:proofErr w:type="gramStart"/>
+      <w:r>
+        <w:t xml:space="preserve">Al hacer pruebas se </w:t>
+      </w:r>
+      <w:proofErr w:type="spellStart"/>
+      <w:r>
+        <w:t>runea</w:t>
+      </w:r>
+      <w:proofErr w:type="spellEnd"/>
+      <w:r>
+        <w:t xml:space="preserve"> fuera de </w:t>
+      </w:r>
+      <w:proofErr w:type="spellStart"/>
+      <w:r>
+        <w:t>pg</w:t>
+      </w:r>
+      <w:proofErr w:type="spellEnd"/>
+      <w:r>
+        <w:t xml:space="preserve"> </w:t>
+      </w:r>
+      <w:proofErr w:type="spellStart"/>
+      <w:r>
+        <w:t>amin</w:t>
+      </w:r>
+      <w:proofErr w:type="spellEnd"/>
+      <w:r>
+        <w:t xml:space="preserve"> y se pierden cambios?</w:t>
+      </w:r>
+      <w:proofErr w:type="gramEnd"/>
+    </w:p>
+    <w:p>
+      <w:pPr>
+        <w:rPr>
+          <w:highlight w:val="yellow"/>
+        </w:rPr>
+      </w:pPr>
+      <w:r>
+        <w:rPr>
+          <w:highlight w:val="yellow"/>
+        </w:rPr>
+        <w:t xml:space="preserve">sacar </w:t>
+      </w:r>
+      <w:proofErr w:type="spellStart"/>
+      <w:r>
+        <w:rPr>
+          <w:highlight w:val="yellow"/>
+        </w:rPr>
+        <w:t>pagina</w:t>
+      </w:r>
+      <w:proofErr w:type="spellEnd"/>
+      <w:r>
+        <w:rPr>
+          <w:highlight w:val="yellow"/>
+        </w:rPr>
+        <w:t xml:space="preserve"> a la nube</w:t>
+      </w:r>
+    </w:p>
+    <w:p>
+      <w:r>
+        <w:rPr>
+          <w:highlight w:val="green"/>
+        </w:rPr>
         <w:t>en referencias</w:t>
       </w:r>
       <w:r>
+        <w:rPr>
+          <w:highlight w:val="green"/>
+        </w:rPr>
         <w:t xml:space="preserve"> </w:t>
       </w:r>
       <w:hyperlink r:id="rId4" w:history="1">
         <w:r>
           <w:rPr>
             <w:rStyle w:val="Hipervnculo"/>
+            <w:highlight w:val="green"/>
           </w:rPr>
-          <w:t>https://catalogoceapat.imserso.es/productos/categorias/vari</w:t>
-        </w:r>
-        <w:r>
-          <w:rPr>
-            <w:rStyle w:val="Hipervnculo"/>
-          </w:rPr>
-          <w:t>a</w:t>
-        </w:r>
-        <w:r>
-          <w:rPr>
-            <w:rStyle w:val="Hipervnculo"/>
-          </w:rPr>
-          <w:t>scategorias</w:t>
+          <w:t>https://catalogoceapat.imserso.es/productos/categorias/variascategorias</w:t>
         </w:r>
       </w:hyperlink>
       <w:r>
@@ -92,101 +264,157 @@
     </w:p>
     <w:p>
       <w:r>
-        <w:t>distinguir entre dos tipos de ELA bulbar y espinal</w:t>
+        <w:t>añadir enlaces de ejemplos de uso</w:t>
       </w:r>
     </w:p>
     <w:p>
       <w:r>
-        <w:t>sugerir que se mire la financiación según su comunidad autónoma y especificar para castilla y león cual es</w:t>
-      </w:r>
-      <w:r>
-        <w:t>, consultar catalogo de su comunidad</w:t>
+        <w:t xml:space="preserve">Cambiar el color de la página a </w:t>
+      </w:r>
+      <w:proofErr w:type="gramStart"/>
+      <w:r>
+        <w:t>verde  (</w:t>
+      </w:r>
+      <w:proofErr w:type="gramEnd"/>
+      <w:r>
+        <w:t>color representante de la ELA)</w:t>
       </w:r>
     </w:p>
     <w:p>
       <w:r>
-        <w:t>añadir enlaces de ejemplos de uso</w:t>
+        <w:t xml:space="preserve">Con lector ocular </w:t>
+      </w:r>
+      <w:proofErr w:type="gramStart"/>
+      <w:r>
+        <w:t>decir</w:t>
+      </w:r>
+      <w:proofErr w:type="gramEnd"/>
+      <w:r>
+        <w:t xml:space="preserve"> que hay que evitar luces directas y apagar dispositivos como televisiones</w:t>
       </w:r>
     </w:p>
     <w:p>
       <w:r>
-        <w:t>añadir opciones de domotica (Alexa configurada para subir persianas o encender luces)</w:t>
-      </w:r>
+        <w:t xml:space="preserve">la escala es de propia cosecha se puede hacer eso? </w:t>
+      </w:r>
+      <w:proofErr w:type="spellStart"/>
+      <w:proofErr w:type="gramStart"/>
+      <w:r>
+        <w:t>Cual</w:t>
+      </w:r>
+      <w:proofErr w:type="spellEnd"/>
+      <w:r>
+        <w:t xml:space="preserve"> es mi validez para decidir los criterios y umbrales?</w:t>
+      </w:r>
+      <w:proofErr w:type="gramEnd"/>
     </w:p>
     <w:p>
       <w:r>
-        <w:t>Cambiar el color de la página a verde  (color representante de la ELA)</w:t>
+        <w:t>Ajustar estilos, no puede haber estilos en ninguna otra pestaña que no sea la de estilos</w:t>
       </w:r>
     </w:p>
     <w:p>
       <w:r>
-        <w:t>Con lector ocular decir que hay que evitar luces directas y apagar dispositivos como televisiones</w:t>
-      </w:r>
+        <w:t xml:space="preserve">Añadir </w:t>
+      </w:r>
+      <w:r>
+        <w:t xml:space="preserve">explicación </w:t>
+      </w:r>
+      <w:proofErr w:type="spellStart"/>
+      <w:r>
+        <w:t>domotica</w:t>
+      </w:r>
+      <w:proofErr w:type="spellEnd"/>
+      <w:r>
+        <w:t xml:space="preserve"> a</w:t>
+      </w:r>
+      <w:r>
+        <w:t xml:space="preserve"> </w:t>
+      </w:r>
+      <w:proofErr w:type="gramStart"/>
+      <w:r>
+        <w:t xml:space="preserve">pestaña </w:t>
+      </w:r>
+      <w:r>
+        <w:t xml:space="preserve"> </w:t>
+      </w:r>
+      <w:proofErr w:type="spellStart"/>
+      <w:r>
+        <w:t>saac</w:t>
+      </w:r>
+      <w:proofErr w:type="spellEnd"/>
+      <w:proofErr w:type="gramEnd"/>
     </w:p>
     <w:p>
       <w:r>
-        <w:t xml:space="preserve">En el nivel de comprensión </w:t>
-      </w:r>
-      <w:r>
-        <w:t>cambiarlo a alfabetización por personas que igual no saben leer (poner ej como prefieres comunicarte mediante frases o pictogramas</w:t>
+        <w:t xml:space="preserve">Editar </w:t>
+      </w:r>
+      <w:proofErr w:type="spellStart"/>
+      <w:r>
+        <w:t>feedback</w:t>
+      </w:r>
+      <w:proofErr w:type="spellEnd"/>
+      <w:r>
+        <w:t xml:space="preserve"> gracias</w:t>
       </w:r>
     </w:p>
     <w:p>
-      <w:pPr>
-        <w:rPr>
-          <w:color w:val="EE0000"/>
-        </w:rPr>
-      </w:pPr>
-      <w:r>
-        <w:rPr>
-          <w:color w:val="EE0000"/>
-        </w:rPr>
-        <w:t xml:space="preserve">Preguntar que tienen ya (si ya tienen eye tracker por ejemplo no recomendar)? </w:t>
-      </w:r>
-    </w:p>
-    <w:p>
-      <w:r>
-        <w:t>Hardware propio cambiarlo por la opción ninguno para que así se sepa que recomienda cosas de baja tecnología</w:t>
-      </w:r>
-    </w:p>
-    <w:p>
-      <w:r>
-        <w:t>Soplido y barbilla casi no se usan así que capar un poco</w:t>
-      </w:r>
-    </w:p>
-    <w:p>
-      <w:r>
-        <w:t>Cuando se sugiera algo de alta tecnología recordar que la de baja es buena para ciertas situaciones como lluvia, ducha, mucho sol, nos quedamos sin batería o se rompe…</w:t>
-      </w:r>
-    </w:p>
-    <w:p>
-      <w:r>
-        <w:t>Poner para mayor asesoramiento contactar con la asociación</w:t>
-      </w:r>
-    </w:p>
-    <w:p>
-      <w:r>
-        <w:t>Cambiar introducir tu nombre por dato semi anonimizado (por ejemplo tu animal favorito y las dos primeras letras de tu apellido)</w:t>
-      </w:r>
-    </w:p>
-    <w:p>
-      <w:pPr>
-        <w:rPr>
-          <w:color w:val="EE0000"/>
-        </w:rPr>
-      </w:pPr>
-      <w:r>
-        <w:rPr>
-          <w:color w:val="EE0000"/>
-        </w:rPr>
-        <w:t>Poner un aviso de que se respeta la confidencialidad y anonimizacion de datos</w:t>
-      </w:r>
-    </w:p>
-    <w:p>
-      <w:r>
-        <w:lastRenderedPageBreak/>
-        <w:t>la escala es de propia cosecha se puede hacer eso? Cual es mi validez para decidir los criterios y umbrales?</w:t>
-      </w:r>
+      <w:r>
+        <w:rPr>
+          <w:highlight w:val="green"/>
+        </w:rPr>
+        <w:t xml:space="preserve">Añadir a </w:t>
+      </w:r>
+      <w:proofErr w:type="spellStart"/>
+      <w:r>
+        <w:rPr>
+          <w:highlight w:val="green"/>
+        </w:rPr>
+        <w:t>ia</w:t>
+      </w:r>
+      <w:proofErr w:type="spellEnd"/>
+      <w:r>
+        <w:rPr>
+          <w:highlight w:val="green"/>
+        </w:rPr>
+        <w:t xml:space="preserve"> </w:t>
+      </w:r>
+      <w:proofErr w:type="spellStart"/>
+      <w:r>
+        <w:rPr>
+          <w:highlight w:val="green"/>
+        </w:rPr>
+        <w:t>prompt</w:t>
+      </w:r>
+      <w:proofErr w:type="spellEnd"/>
+      <w:r>
+        <w:rPr>
+          <w:highlight w:val="green"/>
+        </w:rPr>
+        <w:t xml:space="preserve"> generación del sistema de </w:t>
+      </w:r>
+      <w:proofErr w:type="spellStart"/>
+      <w:r>
+        <w:rPr>
+          <w:highlight w:val="green"/>
+        </w:rPr>
+        <w:t>anonimizacion</w:t>
+      </w:r>
+      <w:proofErr w:type="spellEnd"/>
+      <w:r>
+        <w:rPr>
+          <w:highlight w:val="green"/>
+        </w:rPr>
+        <w:t xml:space="preserve"> </w:t>
+      </w:r>
+      <w:proofErr w:type="spellStart"/>
+      <w:r>
+        <w:rPr>
+          <w:highlight w:val="green"/>
+        </w:rPr>
+        <w:t>automatico</w:t>
+      </w:r>
+      <w:proofErr w:type="spellEnd"/>
     </w:p>
     <w:sectPr>
       <w:pgSz w:w="11906" w:h="16838"/>

</xml_diff>

<commit_message>
Cambios perifericos, ajuste alfabetizacion
</commit_message>
<xml_diff>
--- a/Base de datos/mejoras.docx
+++ b/Base de datos/mejoras.docx
@@ -73,21 +73,7 @@
         <w:rPr>
           <w:highlight w:val="green"/>
         </w:rPr>
-        <w:t xml:space="preserve"> ya que yo he hecho una </w:t>
-      </w:r>
-      <w:proofErr w:type="gramStart"/>
-      <w:r>
-        <w:rPr>
-          <w:highlight w:val="green"/>
-        </w:rPr>
-        <w:t>selección</w:t>
-      </w:r>
-      <w:proofErr w:type="gramEnd"/>
-      <w:r>
-        <w:rPr>
-          <w:highlight w:val="green"/>
-        </w:rPr>
-        <w:t xml:space="preserve"> pero seguro hay muchos </w:t>
+        <w:t xml:space="preserve"> ya que yo he hecho una selección pero seguro hay muchos </w:t>
       </w:r>
       <w:proofErr w:type="spellStart"/>
       <w:r>
@@ -254,16 +240,7 @@
           <w:iCs/>
           <w:highlight w:val="green"/>
         </w:rPr>
-        <w:t>“Criterios basados en la arquitectura de requisitos funcionales de los dispositivos y las etapas de progresión de la enfermedad según la escala ALSFRS-R (escala funcional de la ELA)</w:t>
-      </w:r>
-      <w:proofErr w:type="gramStart"/>
-      <w:r>
-        <w:rPr>
-          <w:i/>
-          <w:iCs/>
-          <w:highlight w:val="green"/>
-        </w:rPr>
-        <w:t>”</w:t>
+        <w:t>“Criterios basados en la arquitectura de requisitos funcionales de los dispositivos y las etapas de progresión de la enfermedad según la escala ALSFRS-R (escala funcional de la ELA)”</w:t>
       </w:r>
       <w:r>
         <w:rPr>
@@ -275,14 +252,7 @@
         <w:rPr>
           <w:highlight w:val="green"/>
         </w:rPr>
-        <w:t>Ajustar</w:t>
-      </w:r>
-      <w:proofErr w:type="gramEnd"/>
-      <w:r>
-        <w:rPr>
-          <w:highlight w:val="green"/>
-        </w:rPr>
-        <w:t xml:space="preserve"> estilos, no puede haber estilos en ninguna otra pestaña que no sea la de estilos</w:t>
+        <w:t>Ajustar estilos, no puede haber estilos en ninguna otra pestaña que no sea la de estilos</w:t>
       </w:r>
     </w:p>
     <w:p>
@@ -340,6 +310,81 @@
           <w:highlight w:val="green"/>
         </w:rPr>
         <w:t>automatico</w:t>
+      </w:r>
+      <w:proofErr w:type="spellEnd"/>
+    </w:p>
+    <w:p>
+      <w:r>
+        <w:t xml:space="preserve">Comentar el </w:t>
+      </w:r>
+      <w:proofErr w:type="spellStart"/>
+      <w:r>
+        <w:t>codigo</w:t>
+      </w:r>
+      <w:proofErr w:type="spellEnd"/>
+    </w:p>
+    <w:p>
+      <w:r>
+        <w:t xml:space="preserve">Preguntar si al editar </w:t>
+      </w:r>
+      <w:proofErr w:type="spellStart"/>
+      <w:r>
+        <w:t>bd</w:t>
+      </w:r>
+      <w:proofErr w:type="spellEnd"/>
+      <w:r>
+        <w:t xml:space="preserve"> se borra el historial</w:t>
+      </w:r>
+    </w:p>
+    <w:p>
+      <w:r>
+        <w:t xml:space="preserve">Añadir algo en plan si se esta haciendo este cuestionario a través de la asociación </w:t>
+      </w:r>
+      <w:proofErr w:type="spellStart"/>
+      <w:r>
+        <w:t>ela</w:t>
+      </w:r>
+      <w:proofErr w:type="spellEnd"/>
+      <w:r>
+        <w:t xml:space="preserve"> marcar esta casilla si no nada para distinguir</w:t>
+      </w:r>
+    </w:p>
+    <w:p>
+      <w:r>
+        <w:t>Idioma solo funciona español</w:t>
+      </w:r>
+      <w:r>
+        <w:t xml:space="preserve">, en </w:t>
+      </w:r>
+      <w:proofErr w:type="spellStart"/>
+      <w:r>
+        <w:t>bd</w:t>
+      </w:r>
+      <w:proofErr w:type="spellEnd"/>
+      <w:r>
+        <w:t xml:space="preserve"> no están asignados los demás </w:t>
+      </w:r>
+    </w:p>
+    <w:p>
+      <w:r>
+        <w:t>Ahora se ha borrado entorno</w:t>
+      </w:r>
+    </w:p>
+    <w:p>
+      <w:r>
+        <w:t xml:space="preserve">No aparece el sistema de </w:t>
+      </w:r>
+      <w:proofErr w:type="spellStart"/>
+      <w:r>
+        <w:t>sorry</w:t>
+      </w:r>
+      <w:proofErr w:type="spellEnd"/>
+      <w:r>
+        <w:t xml:space="preserve"> no encontramos </w:t>
+      </w:r>
+      <w:proofErr w:type="spellStart"/>
+      <w:r>
+        <w:t>nadota</w:t>
       </w:r>
       <w:proofErr w:type="spellEnd"/>
     </w:p>
@@ -956,6 +1001,7 @@
   <w:style w:type="character" w:default="1" w:styleId="Fuentedeprrafopredeter">
     <w:name w:val="Default Paragraph Font"/>
     <w:uiPriority w:val="1"/>
+    <w:semiHidden/>
     <w:unhideWhenUsed/>
   </w:style>
   <w:style w:type="table" w:default="1" w:styleId="Tablanormal">

</xml_diff>

<commit_message>
Código comentado y base de datos ampliada
</commit_message>
<xml_diff>
--- a/Base de datos/mejoras.docx
+++ b/Base de datos/mejoras.docx
@@ -3,22 +3,19 @@
 <w:document xmlns:wpc="http://schemas.microsoft.com/office/word/2010/wordprocessingCanvas" xmlns:cx="http://schemas.microsoft.com/office/drawing/2014/chartex" xmlns:cx1="http://schemas.microsoft.com/office/drawing/2015/9/8/chartex" xmlns:cx2="http://schemas.microsoft.com/office/drawing/2015/10/21/chartex" xmlns:cx3="http://schemas.microsoft.com/office/drawing/2016/5/9/chartex" xmlns:cx4="http://schemas.microsoft.com/office/drawing/2016/5/10/chartex" xmlns:cx5="http://schemas.microsoft.com/office/drawing/2016/5/11/chartex" xmlns:cx6="http://schemas.microsoft.com/office/drawing/2016/5/12/chartex" xmlns:cx7="http://schemas.microsoft.com/office/drawing/2016/5/13/chartex" xmlns:cx8="http://schemas.microsoft.com/office/drawing/2016/5/14/chartex" xmlns:mc="http://schemas.openxmlformats.org/markup-compatibility/2006" xmlns:aink="http://schemas.microsoft.com/office/drawing/2016/ink" xmlns:am3d="http://schemas.microsoft.com/office/drawing/2017/model3d" xmlns:o="urn:schemas-microsoft-com:office:office" xmlns:oel="http://schemas.microsoft.com/office/2019/extlst" xmlns:r="http://schemas.openxmlformats.org/officeDocument/2006/relationships" xmlns:m="http://schemas.openxmlformats.org/officeDocument/2006/math" xmlns:v="urn:schemas-microsoft-com:vml" xmlns:wp14="http://schemas.microsoft.com/office/word/2010/wordprocessingDrawing" xmlns:wp="http://schemas.openxmlformats.org/drawingml/2006/wordprocessingDrawing" xmlns:w10="urn:schemas-microsoft-com:office:word" xmlns:w="http://schemas.openxmlformats.org/wordprocessingml/2006/main" xmlns:w14="http://schemas.microsoft.com/office/word/2010/wordml" xmlns:w15="http://schemas.microsoft.com/office/word/2012/wordml" xmlns:w16cex="http://schemas.microsoft.com/office/word/2018/wordml/cex" xmlns:w16cid="http://schemas.microsoft.com/office/word/2016/wordml/cid" xmlns:w16="http://schemas.microsoft.com/office/word/2018/wordml" xmlns:w16du="http://schemas.microsoft.com/office/word/2023/wordml/word16du" xmlns:w16sdtdh="http://schemas.microsoft.com/office/word/2020/wordml/sdtdatahash" xmlns:w16sdtfl="http://schemas.microsoft.com/office/word/2024/wordml/sdtformatlock" xmlns:w16se="http://schemas.microsoft.com/office/word/2015/wordml/symex" xmlns:wpg="http://schemas.microsoft.com/office/word/2010/wordprocessingGroup" xmlns:wpi="http://schemas.microsoft.com/office/word/2010/wordprocessingInk" xmlns:wne="http://schemas.microsoft.com/office/word/2006/wordml" xmlns:wps="http://schemas.microsoft.com/office/word/2010/wordprocessingShape" mc:Ignorable="w14 w15 w16se w16cid w16 w16cex w16sdtdh w16sdtfl w16du wp14">
   <w:body>
     <w:p>
-      <w:pPr>
-        <w:rPr>
-          <w:highlight w:val="green"/>
-        </w:rPr>
-      </w:pPr>
-      <w:r>
-        <w:rPr>
-          <w:highlight w:val="green"/>
-        </w:rPr>
+      <w:r>
         <w:t>estudio hacer todas las combis posibles y ver donde no sale nada ahí hay que mejorar</w:t>
       </w:r>
       <w:r>
-        <w:rPr>
-          <w:highlight w:val="green"/>
-        </w:rPr>
-        <w:t xml:space="preserve">. Preguntar a la ia todas las combinaciones a hacer para estudiar </w:t>
+        <w:t xml:space="preserve">. Preguntar a la </w:t>
+      </w:r>
+      <w:proofErr w:type="spellStart"/>
+      <w:r>
+        <w:t>ia</w:t>
+      </w:r>
+      <w:proofErr w:type="spellEnd"/>
+      <w:r>
+        <w:t xml:space="preserve"> todas las combinaciones a hacer para estudiar </w:t>
       </w:r>
     </w:p>
     <w:p>
@@ -31,7 +28,21 @@
         <w:rPr>
           <w:highlight w:val="green"/>
         </w:rPr>
-        <w:t>cambiar en metodología lo de 29 saac iniciales para especificar q hay periféricos y bancos de voz</w:t>
+        <w:t xml:space="preserve">cambiar en metodología lo de 29 </w:t>
+      </w:r>
+      <w:proofErr w:type="spellStart"/>
+      <w:r>
+        <w:rPr>
+          <w:highlight w:val="green"/>
+        </w:rPr>
+        <w:t>saac</w:t>
+      </w:r>
+      <w:proofErr w:type="spellEnd"/>
+      <w:r>
+        <w:rPr>
+          <w:highlight w:val="green"/>
+        </w:rPr>
+        <w:t xml:space="preserve"> iniciales para especificar q hay periféricos y bancos de voz</w:t>
       </w:r>
     </w:p>
     <w:p>
@@ -45,13 +56,83 @@
         <w:rPr>
           <w:highlight w:val="green"/>
         </w:rPr>
-        <w:t xml:space="preserve"> ya que yo he hecho una selección pero seguro hay muchos mas y otros que aun no se hayan inventado</w:t>
-      </w:r>
-      <w:r>
-        <w:rPr>
-          <w:highlight w:val="green"/>
-        </w:rPr>
-        <w:t xml:space="preserve"> también validar mas el cuestionario hacer mas pruebas por ejemplo con ELA Andalucia</w:t>
+        <w:t xml:space="preserve"> ya que yo he hecho una </w:t>
+      </w:r>
+      <w:proofErr w:type="gramStart"/>
+      <w:r>
+        <w:rPr>
+          <w:highlight w:val="green"/>
+        </w:rPr>
+        <w:t>selección</w:t>
+      </w:r>
+      <w:proofErr w:type="gramEnd"/>
+      <w:r>
+        <w:rPr>
+          <w:highlight w:val="green"/>
+        </w:rPr>
+        <w:t xml:space="preserve"> pero seguro hay muchos </w:t>
+      </w:r>
+      <w:proofErr w:type="spellStart"/>
+      <w:r>
+        <w:rPr>
+          <w:highlight w:val="green"/>
+        </w:rPr>
+        <w:t>mas</w:t>
+      </w:r>
+      <w:proofErr w:type="spellEnd"/>
+      <w:r>
+        <w:rPr>
+          <w:highlight w:val="green"/>
+        </w:rPr>
+        <w:t xml:space="preserve"> y otros que </w:t>
+      </w:r>
+      <w:proofErr w:type="spellStart"/>
+      <w:r>
+        <w:rPr>
+          <w:highlight w:val="green"/>
+        </w:rPr>
+        <w:t>aun</w:t>
+      </w:r>
+      <w:proofErr w:type="spellEnd"/>
+      <w:r>
+        <w:rPr>
+          <w:highlight w:val="green"/>
+        </w:rPr>
+        <w:t xml:space="preserve"> no se hayan inventado</w:t>
+      </w:r>
+      <w:r>
+        <w:rPr>
+          <w:highlight w:val="green"/>
+        </w:rPr>
+        <w:t xml:space="preserve"> también validar </w:t>
+      </w:r>
+      <w:proofErr w:type="spellStart"/>
+      <w:r>
+        <w:rPr>
+          <w:highlight w:val="green"/>
+        </w:rPr>
+        <w:t>mas</w:t>
+      </w:r>
+      <w:proofErr w:type="spellEnd"/>
+      <w:r>
+        <w:rPr>
+          <w:highlight w:val="green"/>
+        </w:rPr>
+        <w:t xml:space="preserve"> el cuestionario hacer </w:t>
+      </w:r>
+      <w:proofErr w:type="spellStart"/>
+      <w:r>
+        <w:rPr>
+          <w:highlight w:val="green"/>
+        </w:rPr>
+        <w:t>mas</w:t>
+      </w:r>
+      <w:proofErr w:type="spellEnd"/>
+      <w:r>
+        <w:rPr>
+          <w:highlight w:val="green"/>
+        </w:rPr>
+        <w:t xml:space="preserve"> pruebas por ejemplo con ELA Andalucia</w:t>
       </w:r>
       <w:r>
         <w:t xml:space="preserve"> </w:t>
@@ -60,7 +141,30 @@
         <w:rPr>
           <w:highlight w:val="green"/>
         </w:rPr>
-        <w:t>añadir también implementar saacs sin ayuda como la lengua de signos y un diccionario de esta</w:t>
+        <w:t xml:space="preserve">añadir también implementar </w:t>
+      </w:r>
+      <w:proofErr w:type="spellStart"/>
+      <w:r>
+        <w:rPr>
+          <w:highlight w:val="green"/>
+        </w:rPr>
+        <w:t>saacs</w:t>
+      </w:r>
+      <w:proofErr w:type="spellEnd"/>
+      <w:r>
+        <w:rPr>
+          <w:highlight w:val="green"/>
+        </w:rPr>
+        <w:t xml:space="preserve"> sin ayuda como la lengua de signos y un diccionario de esta</w:t>
+      </w:r>
+      <w:r>
+        <w:t xml:space="preserve"> </w:t>
+      </w:r>
+      <w:r>
+        <w:rPr>
+          <w:highlight w:val="green"/>
+        </w:rPr>
+        <w:t>añadir enlaces ejemplos de uso</w:t>
       </w:r>
     </w:p>
     <w:p>
@@ -73,7 +177,21 @@
         <w:rPr>
           <w:highlight w:val="yellow"/>
         </w:rPr>
-        <w:t>sacar pagina a la nube</w:t>
+        <w:t xml:space="preserve">sacar </w:t>
+      </w:r>
+      <w:proofErr w:type="spellStart"/>
+      <w:r>
+        <w:rPr>
+          <w:highlight w:val="yellow"/>
+        </w:rPr>
+        <w:t>pagina</w:t>
+      </w:r>
+      <w:proofErr w:type="spellEnd"/>
+      <w:r>
+        <w:rPr>
+          <w:highlight w:val="yellow"/>
+        </w:rPr>
+        <w:t xml:space="preserve"> a la nube</w:t>
       </w:r>
     </w:p>
     <w:p>
@@ -104,66 +222,156 @@
     </w:p>
     <w:p>
       <w:r>
-        <w:t>añadir enlaces de ejemplos de uso</w:t>
+        <w:rPr>
+          <w:b/>
+          <w:bCs/>
+          <w:highlight w:val="green"/>
+        </w:rPr>
+        <w:t>En lugar de "mis criterios":</w:t>
+      </w:r>
+      <w:r>
+        <w:rPr>
+          <w:highlight w:val="green"/>
+        </w:rPr>
+        <w:t xml:space="preserve"> Di que son </w:t>
+      </w:r>
+      <w:r>
+        <w:rPr>
+          <w:i/>
+          <w:iCs/>
+          <w:highlight w:val="green"/>
+        </w:rPr>
+        <w:t>“Criterios basados en la arquitectura de requisitos funcionales de los dispositivos y las etapas de progresión de la enfermedad según la escala ALSFRS-R (escala funcional de la ELA)</w:t>
+      </w:r>
+      <w:proofErr w:type="gramStart"/>
+      <w:r>
+        <w:rPr>
+          <w:i/>
+          <w:iCs/>
+          <w:highlight w:val="green"/>
+        </w:rPr>
+        <w:t>”</w:t>
+      </w:r>
+      <w:r>
+        <w:rPr>
+          <w:highlight w:val="green"/>
+        </w:rPr>
+        <w:t>.</w:t>
+      </w:r>
+      <w:r>
+        <w:rPr>
+          <w:highlight w:val="green"/>
+        </w:rPr>
+        <w:t>Ajustar</w:t>
+      </w:r>
+      <w:proofErr w:type="gramEnd"/>
+      <w:r>
+        <w:rPr>
+          <w:highlight w:val="green"/>
+        </w:rPr>
+        <w:t xml:space="preserve"> estilos, no puede haber estilos en ninguna otra pestaña que no sea la de estilos</w:t>
       </w:r>
     </w:p>
     <w:p>
-      <w:r>
-        <w:rPr>
-          <w:b/>
-          <w:bCs/>
-          <w:highlight w:val="green"/>
-        </w:rPr>
-        <w:t>En lugar de "mis criterios":</w:t>
-      </w:r>
-      <w:r>
-        <w:rPr>
-          <w:highlight w:val="green"/>
-        </w:rPr>
-        <w:t xml:space="preserve"> Di que son </w:t>
-      </w:r>
-      <w:r>
-        <w:rPr>
-          <w:i/>
-          <w:iCs/>
-          <w:highlight w:val="green"/>
-        </w:rPr>
-        <w:t>“Criterios basados en la arquitectura de requisitos funcionales de los dispositivos y las etapas de progresión de la enfermedad según la escala ALSFRS-R (escala funcional de la ELA)”</w:t>
-      </w:r>
-      <w:r>
-        <w:rPr>
-          <w:highlight w:val="green"/>
-        </w:rPr>
-        <w:t>.</w:t>
-      </w:r>
-      <w:r>
-        <w:rPr>
-          <w:highlight w:val="green"/>
-        </w:rPr>
-        <w:t>Ajustar estilos, no puede haber estilos en ninguna otra pestaña que no sea la de estilos</w:t>
-      </w:r>
+      <w:pPr>
+        <w:rPr>
+          <w:u w:val="single"/>
+        </w:rPr>
+      </w:pPr>
+      <w:r>
+        <w:rPr>
+          <w:highlight w:val="green"/>
+        </w:rPr>
+        <w:t xml:space="preserve">Añadir a </w:t>
+      </w:r>
+      <w:proofErr w:type="spellStart"/>
+      <w:r>
+        <w:rPr>
+          <w:highlight w:val="green"/>
+        </w:rPr>
+        <w:t>ia</w:t>
+      </w:r>
+      <w:proofErr w:type="spellEnd"/>
+      <w:r>
+        <w:rPr>
+          <w:highlight w:val="green"/>
+        </w:rPr>
+        <w:t xml:space="preserve"> </w:t>
+      </w:r>
+      <w:proofErr w:type="spellStart"/>
+      <w:r>
+        <w:rPr>
+          <w:highlight w:val="green"/>
+        </w:rPr>
+        <w:t>prompt</w:t>
+      </w:r>
+      <w:proofErr w:type="spellEnd"/>
+      <w:r>
+        <w:rPr>
+          <w:highlight w:val="green"/>
+        </w:rPr>
+        <w:t xml:space="preserve"> generación del sistema de </w:t>
+      </w:r>
+      <w:proofErr w:type="spellStart"/>
+      <w:r>
+        <w:rPr>
+          <w:highlight w:val="green"/>
+        </w:rPr>
+        <w:t>anonimizacion</w:t>
+      </w:r>
+      <w:proofErr w:type="spellEnd"/>
+      <w:r>
+        <w:rPr>
+          <w:highlight w:val="green"/>
+        </w:rPr>
+        <w:t xml:space="preserve"> </w:t>
+      </w:r>
+      <w:r>
+        <w:rPr>
+          <w:highlight w:val="green"/>
+        </w:rPr>
+        <w:t>automático</w:t>
+      </w:r>
+      <w:r>
+        <w:t xml:space="preserve"> </w:t>
+      </w:r>
+      <w:r>
+        <w:rPr>
+          <w:highlight w:val="green"/>
+        </w:rPr>
+        <w:t xml:space="preserve">y conexión vs con </w:t>
+      </w:r>
+      <w:proofErr w:type="spellStart"/>
+      <w:r>
+        <w:rPr>
+          <w:highlight w:val="green"/>
+        </w:rPr>
+        <w:t>pg</w:t>
+      </w:r>
+      <w:proofErr w:type="spellEnd"/>
+      <w:r>
+        <w:rPr>
+          <w:highlight w:val="green"/>
+        </w:rPr>
+        <w:t xml:space="preserve"> </w:t>
+      </w:r>
+      <w:proofErr w:type="spellStart"/>
+      <w:r>
+        <w:rPr>
+          <w:highlight w:val="green"/>
+        </w:rPr>
+        <w:t>admin</w:t>
+      </w:r>
+      <w:proofErr w:type="spellEnd"/>
     </w:p>
     <w:p>
       <w:r>
-        <w:rPr>
-          <w:highlight w:val="green"/>
-        </w:rPr>
-        <w:t>Añadir a ia prompt generación del sistema de anonimizacion automatico</w:t>
+        <w:t>Mover estilos</w:t>
       </w:r>
     </w:p>
     <w:p>
       <w:r>
-        <w:t>Comentar el codigo</w:t>
-      </w:r>
-    </w:p>
-    <w:p>
-      <w:r>
-        <w:t>Preguntar si al editar bd se borra el historial</w:t>
-      </w:r>
-    </w:p>
-    <w:p>
-      <w:r>
-        <w:t>Mover estilos</w:t>
+        <w:t>Hay muy pocos de entrada voz</w:t>
       </w:r>
     </w:p>
     <w:sectPr>

</xml_diff>

<commit_message>
Estilos movidos a css
</commit_message>
<xml_diff>
--- a/Base de datos/mejoras.docx
+++ b/Base de datos/mejoras.docx
@@ -7,7 +7,15 @@
         <w:t>estudio hacer todas las combis posibles y ver donde no sale nada ahí hay que mejorar</w:t>
       </w:r>
       <w:r>
-        <w:t xml:space="preserve">. Preguntar a la ia todas las combinaciones a hacer para estudiar </w:t>
+        <w:t xml:space="preserve">. Preguntar a la </w:t>
+      </w:r>
+      <w:proofErr w:type="spellStart"/>
+      <w:r>
+        <w:t>ia</w:t>
+      </w:r>
+      <w:proofErr w:type="spellEnd"/>
+      <w:r>
+        <w:t xml:space="preserve"> todas las combinaciones a hacer para estudiar </w:t>
       </w:r>
     </w:p>
     <w:p>
@@ -20,7 +28,21 @@
         <w:rPr>
           <w:highlight w:val="green"/>
         </w:rPr>
-        <w:t>cambiar en metodología lo de 29 saac iniciales para especificar q hay periféricos y bancos de voz</w:t>
+        <w:t xml:space="preserve">cambiar en metodología lo de 29 </w:t>
+      </w:r>
+      <w:proofErr w:type="spellStart"/>
+      <w:r>
+        <w:rPr>
+          <w:highlight w:val="green"/>
+        </w:rPr>
+        <w:t>saac</w:t>
+      </w:r>
+      <w:proofErr w:type="spellEnd"/>
+      <w:r>
+        <w:rPr>
+          <w:highlight w:val="green"/>
+        </w:rPr>
+        <w:t xml:space="preserve"> iniciales para especificar q hay periféricos y bancos de voz</w:t>
       </w:r>
     </w:p>
     <w:p>
@@ -34,13 +56,83 @@
         <w:rPr>
           <w:highlight w:val="green"/>
         </w:rPr>
-        <w:t xml:space="preserve"> ya que yo he hecho una selección pero seguro hay muchos mas y otros que aun no se hayan inventado</w:t>
-      </w:r>
-      <w:r>
-        <w:rPr>
-          <w:highlight w:val="green"/>
-        </w:rPr>
-        <w:t xml:space="preserve"> también validar mas el cuestionario hacer mas pruebas por ejemplo con ELA Andalucia</w:t>
+        <w:t xml:space="preserve"> ya que yo he hecho una </w:t>
+      </w:r>
+      <w:proofErr w:type="gramStart"/>
+      <w:r>
+        <w:rPr>
+          <w:highlight w:val="green"/>
+        </w:rPr>
+        <w:t>selección</w:t>
+      </w:r>
+      <w:proofErr w:type="gramEnd"/>
+      <w:r>
+        <w:rPr>
+          <w:highlight w:val="green"/>
+        </w:rPr>
+        <w:t xml:space="preserve"> pero seguro hay muchos </w:t>
+      </w:r>
+      <w:proofErr w:type="spellStart"/>
+      <w:r>
+        <w:rPr>
+          <w:highlight w:val="green"/>
+        </w:rPr>
+        <w:t>mas</w:t>
+      </w:r>
+      <w:proofErr w:type="spellEnd"/>
+      <w:r>
+        <w:rPr>
+          <w:highlight w:val="green"/>
+        </w:rPr>
+        <w:t xml:space="preserve"> y otros que </w:t>
+      </w:r>
+      <w:proofErr w:type="spellStart"/>
+      <w:r>
+        <w:rPr>
+          <w:highlight w:val="green"/>
+        </w:rPr>
+        <w:t>aun</w:t>
+      </w:r>
+      <w:proofErr w:type="spellEnd"/>
+      <w:r>
+        <w:rPr>
+          <w:highlight w:val="green"/>
+        </w:rPr>
+        <w:t xml:space="preserve"> no se hayan inventado</w:t>
+      </w:r>
+      <w:r>
+        <w:rPr>
+          <w:highlight w:val="green"/>
+        </w:rPr>
+        <w:t xml:space="preserve"> también validar </w:t>
+      </w:r>
+      <w:proofErr w:type="spellStart"/>
+      <w:r>
+        <w:rPr>
+          <w:highlight w:val="green"/>
+        </w:rPr>
+        <w:t>mas</w:t>
+      </w:r>
+      <w:proofErr w:type="spellEnd"/>
+      <w:r>
+        <w:rPr>
+          <w:highlight w:val="green"/>
+        </w:rPr>
+        <w:t xml:space="preserve"> el cuestionario hacer </w:t>
+      </w:r>
+      <w:proofErr w:type="spellStart"/>
+      <w:r>
+        <w:rPr>
+          <w:highlight w:val="green"/>
+        </w:rPr>
+        <w:t>mas</w:t>
+      </w:r>
+      <w:proofErr w:type="spellEnd"/>
+      <w:r>
+        <w:rPr>
+          <w:highlight w:val="green"/>
+        </w:rPr>
+        <w:t xml:space="preserve"> pruebas por ejemplo con ELA Andalucia</w:t>
       </w:r>
       <w:r>
         <w:t xml:space="preserve"> </w:t>
@@ -49,7 +141,21 @@
         <w:rPr>
           <w:highlight w:val="green"/>
         </w:rPr>
-        <w:t>añadir también implementar saacs sin ayuda como la lengua de signos y un diccionario de esta</w:t>
+        <w:t xml:space="preserve">añadir también implementar </w:t>
+      </w:r>
+      <w:proofErr w:type="spellStart"/>
+      <w:r>
+        <w:rPr>
+          <w:highlight w:val="green"/>
+        </w:rPr>
+        <w:t>saacs</w:t>
+      </w:r>
+      <w:proofErr w:type="spellEnd"/>
+      <w:r>
+        <w:rPr>
+          <w:highlight w:val="green"/>
+        </w:rPr>
+        <w:t xml:space="preserve"> sin ayuda como la lengua de signos y un diccionario de esta</w:t>
       </w:r>
       <w:r>
         <w:t xml:space="preserve"> </w:t>
@@ -71,7 +177,21 @@
         <w:rPr>
           <w:highlight w:val="yellow"/>
         </w:rPr>
-        <w:t>sacar pagina a la nube</w:t>
+        <w:t xml:space="preserve">sacar </w:t>
+      </w:r>
+      <w:proofErr w:type="spellStart"/>
+      <w:r>
+        <w:rPr>
+          <w:highlight w:val="yellow"/>
+        </w:rPr>
+        <w:t>pagina</w:t>
+      </w:r>
+      <w:proofErr w:type="spellEnd"/>
+      <w:r>
+        <w:rPr>
+          <w:highlight w:val="yellow"/>
+        </w:rPr>
+        <w:t xml:space="preserve"> a la nube</w:t>
       </w:r>
     </w:p>
     <w:p>
@@ -121,7 +241,16 @@
           <w:iCs/>
           <w:highlight w:val="green"/>
         </w:rPr>
-        <w:t>“Criterios basados en la arquitectura de requisitos funcionales de los dispositivos y las etapas de progresión de la enfermedad según la escala ALSFRS-R (escala funcional de la ELA)”</w:t>
+        <w:t>“Criterios basados en la arquitectura de requisitos funcionales de los dispositivos y las etapas de progresión de la enfermedad según la escala ALSFRS-R (escala funcional de la ELA)</w:t>
+      </w:r>
+      <w:proofErr w:type="gramStart"/>
+      <w:r>
+        <w:rPr>
+          <w:i/>
+          <w:iCs/>
+          <w:highlight w:val="green"/>
+        </w:rPr>
+        <w:t>”</w:t>
       </w:r>
       <w:r>
         <w:rPr>
@@ -133,7 +262,14 @@
         <w:rPr>
           <w:highlight w:val="green"/>
         </w:rPr>
-        <w:t>Ajustar estilos, no puede haber estilos en ninguna otra pestaña que no sea la de estilos</w:t>
+        <w:t>Ajustar</w:t>
+      </w:r>
+      <w:proofErr w:type="gramEnd"/>
+      <w:r>
+        <w:rPr>
+          <w:highlight w:val="green"/>
+        </w:rPr>
+        <w:t xml:space="preserve"> estilos, no puede haber estilos en ninguna otra pestaña que no sea la de estilos</w:t>
       </w:r>
     </w:p>
     <w:p>
@@ -146,7 +282,49 @@
         <w:rPr>
           <w:highlight w:val="green"/>
         </w:rPr>
-        <w:t xml:space="preserve">Añadir a ia prompt generación del sistema de anonimizacion </w:t>
+        <w:t xml:space="preserve">Añadir a </w:t>
+      </w:r>
+      <w:proofErr w:type="spellStart"/>
+      <w:r>
+        <w:rPr>
+          <w:highlight w:val="green"/>
+        </w:rPr>
+        <w:t>ia</w:t>
+      </w:r>
+      <w:proofErr w:type="spellEnd"/>
+      <w:r>
+        <w:rPr>
+          <w:highlight w:val="green"/>
+        </w:rPr>
+        <w:t xml:space="preserve"> </w:t>
+      </w:r>
+      <w:proofErr w:type="spellStart"/>
+      <w:r>
+        <w:rPr>
+          <w:highlight w:val="green"/>
+        </w:rPr>
+        <w:t>prompt</w:t>
+      </w:r>
+      <w:proofErr w:type="spellEnd"/>
+      <w:r>
+        <w:rPr>
+          <w:highlight w:val="green"/>
+        </w:rPr>
+        <w:t xml:space="preserve"> generación del sistema de </w:t>
+      </w:r>
+      <w:proofErr w:type="spellStart"/>
+      <w:r>
+        <w:rPr>
+          <w:highlight w:val="green"/>
+        </w:rPr>
+        <w:t>anonimizacion</w:t>
+      </w:r>
+      <w:proofErr w:type="spellEnd"/>
+      <w:r>
+        <w:rPr>
+          <w:highlight w:val="green"/>
+        </w:rPr>
+        <w:t xml:space="preserve"> </w:t>
       </w:r>
       <w:r>
         <w:rPr>
@@ -161,24 +339,37 @@
         <w:rPr>
           <w:highlight w:val="green"/>
         </w:rPr>
-        <w:t>y conexión vs con pg admin</w:t>
-      </w:r>
+        <w:t xml:space="preserve">y conexión vs con </w:t>
+      </w:r>
+      <w:proofErr w:type="spellStart"/>
+      <w:r>
+        <w:rPr>
+          <w:highlight w:val="green"/>
+        </w:rPr>
+        <w:t>pg</w:t>
+      </w:r>
+      <w:proofErr w:type="spellEnd"/>
+      <w:r>
+        <w:rPr>
+          <w:highlight w:val="green"/>
+        </w:rPr>
+        <w:t xml:space="preserve"> </w:t>
+      </w:r>
+      <w:proofErr w:type="spellStart"/>
+      <w:r>
+        <w:rPr>
+          <w:highlight w:val="green"/>
+        </w:rPr>
+        <w:t>admin</w:t>
+      </w:r>
+      <w:proofErr w:type="spellEnd"/>
     </w:p>
     <w:p>
-      <w:r>
-        <w:t>Mover estilos</w:t>
-      </w:r>
-    </w:p>
-    <w:p>
-      <w:r>
-        <w:t>Revisar si no se requiere periferico (todas las apps requieren móvil como periferico aun que no requiera eye tracker</w:t>
-      </w:r>
-      <w:r>
-        <w:t>, y a su vez pueden requerir el soporte de brazo articulado</w:t>
-      </w:r>
-      <w:r>
-        <w:t>)</w:t>
-      </w:r>
+      <w:pPr>
+        <w:rPr>
+          <w:u w:val="single"/>
+        </w:rPr>
+      </w:pPr>
     </w:p>
     <w:sectPr>
       <w:pgSz w:w="11906" w:h="16838"/>

</xml_diff>